<commit_message>
Add queries; Draw charts using ChartJS
</commit_message>
<xml_diff>
--- a/Discription/Discription.docx
+++ b/Discription/Discription.docx
@@ -346,7 +346,7 @@
       <w:pPr>
         <w:pStyle w:val="oancuaDanhsach"/>
         <w:numPr>
-          <w:ilvl w:val="0"/>
+          <w:ilvl w:val="1"/>
           <w:numId w:val="3"/>
         </w:numPr>
         <w:rPr>
@@ -363,7 +363,7 @@
           <w:szCs w:val="28"/>
           <w:lang w:val="vi-VN"/>
         </w:rPr>
-        <w:t>Group Employer</w:t>
+        <w:t>applicant2-m1234567890</w:t>
       </w:r>
     </w:p>
     <w:p>
@@ -387,6 +387,54 @@
           <w:szCs w:val="28"/>
           <w:lang w:val="vi-VN"/>
         </w:rPr>
+        <w:t>applicant3-m1234567890</w:t>
+      </w:r>
+    </w:p>
+    <w:p>
+      <w:pPr>
+        <w:pStyle w:val="oancuaDanhsach"/>
+        <w:numPr>
+          <w:ilvl w:val="0"/>
+          <w:numId w:val="3"/>
+        </w:numPr>
+        <w:rPr>
+          <w:rFonts w:asciiTheme="majorHAnsi" w:hAnsiTheme="majorHAnsi" w:cstheme="majorHAnsi"/>
+          <w:sz w:val="28"/>
+          <w:szCs w:val="28"/>
+          <w:lang w:val="vi-VN"/>
+        </w:rPr>
+      </w:pPr>
+      <w:r>
+        <w:rPr>
+          <w:rFonts w:asciiTheme="majorHAnsi" w:hAnsiTheme="majorHAnsi" w:cstheme="majorHAnsi"/>
+          <w:sz w:val="28"/>
+          <w:szCs w:val="28"/>
+          <w:lang w:val="vi-VN"/>
+        </w:rPr>
+        <w:t>Group Employer</w:t>
+      </w:r>
+    </w:p>
+    <w:p>
+      <w:pPr>
+        <w:pStyle w:val="oancuaDanhsach"/>
+        <w:numPr>
+          <w:ilvl w:val="1"/>
+          <w:numId w:val="3"/>
+        </w:numPr>
+        <w:rPr>
+          <w:rFonts w:asciiTheme="majorHAnsi" w:hAnsiTheme="majorHAnsi" w:cstheme="majorHAnsi"/>
+          <w:sz w:val="28"/>
+          <w:szCs w:val="28"/>
+          <w:lang w:val="vi-VN"/>
+        </w:rPr>
+      </w:pPr>
+      <w:r>
+        <w:rPr>
+          <w:rFonts w:asciiTheme="majorHAnsi" w:hAnsiTheme="majorHAnsi" w:cstheme="majorHAnsi"/>
+          <w:sz w:val="28"/>
+          <w:szCs w:val="28"/>
+          <w:lang w:val="vi-VN"/>
+        </w:rPr>
         <w:t>employer1</w:t>
       </w:r>
       <w:r>
@@ -406,6 +454,25 @@
           <w:lang w:val="vi-VN"/>
         </w:rPr>
         <w:t>m1234567890</w:t>
+      </w:r>
+    </w:p>
+    <w:p>
+      <w:pPr>
+        <w:rPr>
+          <w:rFonts w:asciiTheme="majorHAnsi" w:hAnsiTheme="majorHAnsi" w:cstheme="majorHAnsi"/>
+          <w:sz w:val="28"/>
+          <w:szCs w:val="28"/>
+          <w:lang w:val="vi-VN"/>
+        </w:rPr>
+      </w:pPr>
+      <w:r>
+        <w:rPr>
+          <w:rFonts w:asciiTheme="majorHAnsi" w:hAnsiTheme="majorHAnsi" w:cstheme="majorHAnsi"/>
+          <w:sz w:val="28"/>
+          <w:szCs w:val="28"/>
+          <w:lang w:val="vi-VN"/>
+        </w:rPr>
+        <w:t xml:space="preserve">Phần vẽ biểu đồ CharJS theo yêu cầu đề đã hoàn thành </w:t>
       </w:r>
     </w:p>
     <w:p>

</xml_diff>

<commit_message>
Integrated swagger, general paging, private paging
</commit_message>
<xml_diff>
--- a/Discription/Discription.docx
+++ b/Discription/Discription.docx
@@ -67,6 +67,29 @@
           <w:lang w:val="vi-VN"/>
         </w:rPr>
         <w:t xml:space="preserve">Debug ToolBar </w:t>
+      </w:r>
+    </w:p>
+    <w:p>
+      <w:pPr>
+        <w:pStyle w:val="oancuaDanhsach"/>
+        <w:numPr>
+          <w:ilvl w:val="0"/>
+          <w:numId w:val="2"/>
+        </w:numPr>
+        <w:rPr>
+          <w:rFonts w:asciiTheme="majorHAnsi" w:hAnsiTheme="majorHAnsi" w:cstheme="majorHAnsi"/>
+          <w:sz w:val="28"/>
+          <w:szCs w:val="28"/>
+          <w:lang w:val="vi-VN"/>
+        </w:rPr>
+      </w:pPr>
+      <w:r>
+        <w:rPr>
+          <w:rFonts w:asciiTheme="majorHAnsi" w:hAnsiTheme="majorHAnsi" w:cstheme="majorHAnsi"/>
+          <w:sz w:val="28"/>
+          <w:szCs w:val="28"/>
+        </w:rPr>
+        <w:t xml:space="preserve">Swagger </w:t>
       </w:r>
     </w:p>
     <w:p>

</xml_diff>